<commit_message>
Regenerate the DocX exporter fixture
</commit_message>
<xml_diff>
--- a/plugins/markupeditor-exporter-docx/test/fixtures/test-exporter.docx
+++ b/plugins/markupeditor-exporter-docx/test/fixtures/test-exporter.docx
@@ -118,19 +118,11 @@
         <w:pStyle w:val="Body"/>
       </w:pPr>
       <w:r>
-        <w:t xml:space="preserve">
-    </w:t>
-      </w:r>
-      <w:r>
         <w:rPr>
           <w:strike/>
         </w:rPr>
         <w:t xml:space="preserve">Strikethrough text</w:t>
       </w:r>
-      <w:r>
-        <w:t xml:space="preserve">
-</w:t>
-      </w:r>
     </w:p>
     <w:p>
       <w:pPr>
@@ -139,7 +131,7 @@
       <w:r>
         <w:t xml:space="preserve">A </w:t>
       </w:r>
-      <w:hyperlink w:history="1" r:id="rIdtylxamwwnmdxavezj0n14">
+      <w:hyperlink w:history="1" r:id="rIdiqa1hedrqzljdlj2aftqi">
         <w:r>
           <w:rPr>
             <w:rStyle w:val="Hyperlink"/>
@@ -230,7 +222,7 @@
       <w:pPr>
         <w:pStyle w:val="Body"/>
       </w:pPr>
-      <w:hyperlink w:history="1" r:id="rIdx0tyfeyqo04nviegubcry">
+      <w:hyperlink w:history="1" r:id="rIdd_mti-clswa0k99fae4ru">
         <w:r>
           <w:rPr>
             <w:rStyle w:val="Hyperlink"/>
@@ -516,6 +508,7 @@
     </w:p>
     <w:p>
       <w:pPr>
+        <w:pStyle w:val="Body"/>
         <w:pBdr>
           <w:bottom w:val="single" w:color="000000" w:sz="6"/>
         </w:pBdr>

</xml_diff>